<commit_message>
feat: add separate Yao anecdote archive
Co-authored-by: 36613453226Wallen <36613453226Wallen@users.noreply.github.com>
</commit_message>
<xml_diff>
--- a/Prompt-姚勇文章半自动收录流程.docx
+++ b/Prompt-姚勇文章半自动收录流程.docx
@@ -990,6 +990,17 @@
         <w:t>在4的docx命名带一个prompt，取名即可【4这个文段就放在4生成的docx最后，用深灰色吧】]</w:t>
       </w:r>
     </w:p>
+    <w:p>
+      <w:r>
+        <w:rPr>
+          <w:rFonts w:ascii="微软雅黑" w:hAnsi="微软雅黑" w:eastAsia="微软雅黑"/>
+          <w:b/>
+          <w:color w:val="583F70"/>
+          <w:sz w:val="22"/>
+        </w:rPr>
+        <w:t>新增功能：收录姚勇奇闻｜用于奇闻、科幻想象或趣味性材料；归入并列的“姚勇奇闻目录%”，使用独立序号。</w:t>
+      </w:r>
+    </w:p>
     <w:sectPr>
       <w:pgSz w:w="12240" w:h="15840"/>
       <w:pgMar w:top="1008" w:right="1152" w:bottom="1008" w:left="1152" w:header="720" w:footer="720" w:gutter="0"/>

</xml_diff>

<commit_message>
feat: add separate Yao anecdote archive (#9)
Co-authored-by: Cursor Agent <cursoragent@cursor.com>
Co-authored-by: 36613453226Wallen <36613453226Wallen@users.noreply.github.com>
</commit_message>
<xml_diff>
--- a/Prompt-姚勇文章半自动收录流程.docx
+++ b/Prompt-姚勇文章半自动收录流程.docx
@@ -990,6 +990,17 @@
         <w:t>在4的docx命名带一个prompt，取名即可【4这个文段就放在4生成的docx最后，用深灰色吧】]</w:t>
       </w:r>
     </w:p>
+    <w:p>
+      <w:r>
+        <w:rPr>
+          <w:rFonts w:ascii="微软雅黑" w:hAnsi="微软雅黑" w:eastAsia="微软雅黑"/>
+          <w:b/>
+          <w:color w:val="583F70"/>
+          <w:sz w:val="22"/>
+        </w:rPr>
+        <w:t>新增功能：收录姚勇奇闻｜用于奇闻、科幻想象或趣味性材料；归入并列的“姚勇奇闻目录%”，使用独立序号。</w:t>
+      </w:r>
+    </w:p>
     <w:sectPr>
       <w:pgSz w:w="12240" w:h="15840"/>
       <w:pgMar w:top="1008" w:right="1152" w:bottom="1008" w:left="1152" w:header="720" w:footer="720" w:gutter="0"/>

</xml_diff>

<commit_message>
docs: add relationship branch 1.8 archive
Co-authored-by: 36613453226Wallen <36613453226Wallen@users.noreply.github.com>
</commit_message>
<xml_diff>
--- a/Prompt-姚勇文章半自动收录流程.docx
+++ b/Prompt-姚勇文章半自动收录流程.docx
@@ -1001,6 +1001,16 @@
         <w:t>新增功能：收录姚勇奇闻｜用于奇闻、科幻想象或趣味性材料；归入并列的“姚勇奇闻目录%”，使用独立序号。</w:t>
       </w:r>
     </w:p>
+    <w:p>
+      <w:r>
+        <w:rPr>
+          <w:rFonts w:ascii="微软雅黑" w:hAnsi="微软雅黑" w:eastAsia="微软雅黑"/>
+          <w:color w:val="464646"/>
+          <w:sz w:val="20"/>
+        </w:rPr>
+        <w:t>分支编号规则：主文章局部摘录使用“主序号.小标题序号”（如1.8）；分支DOCX不附原文链接，目录不显示空链接。</w:t>
+      </w:r>
+    </w:p>
     <w:sectPr>
       <w:pgSz w:w="12240" w:h="15840"/>
       <w:pgMar w:top="1008" w:right="1152" w:bottom="1008" w:left="1152" w:header="720" w:footer="720" w:gutter="0"/>

</xml_diff>

<commit_message>
docs: add relationship branch 1.8 archive (#12)
Co-authored-by: Cursor Agent <cursoragent@cursor.com>
Co-authored-by: 36613453226Wallen <36613453226Wallen@users.noreply.github.com>
</commit_message>
<xml_diff>
--- a/Prompt-姚勇文章半自动收录流程.docx
+++ b/Prompt-姚勇文章半自动收录流程.docx
@@ -1001,6 +1001,16 @@
         <w:t>新增功能：收录姚勇奇闻｜用于奇闻、科幻想象或趣味性材料；归入并列的“姚勇奇闻目录%”，使用独立序号。</w:t>
       </w:r>
     </w:p>
+    <w:p>
+      <w:r>
+        <w:rPr>
+          <w:rFonts w:ascii="微软雅黑" w:hAnsi="微软雅黑" w:eastAsia="微软雅黑"/>
+          <w:color w:val="464646"/>
+          <w:sz w:val="20"/>
+        </w:rPr>
+        <w:t>分支编号规则：主文章局部摘录使用“主序号.小标题序号”（如1.8）；分支DOCX不附原文链接，目录不显示空链接。</w:t>
+      </w:r>
+    </w:p>
     <w:sectPr>
       <w:pgSz w:w="12240" w:h="15840"/>
       <w:pgMar w:top="1008" w:right="1152" w:bottom="1008" w:left="1152" w:header="720" w:footer="720" w:gutter="0"/>

</xml_diff>

<commit_message>
docs: prefix relationship branch with year
Co-authored-by: 36613453226Wallen <36613453226Wallen@users.noreply.github.com>
</commit_message>
<xml_diff>
--- a/Prompt-姚勇文章半自动收录流程.docx
+++ b/Prompt-姚勇文章半自动收录流程.docx
@@ -1003,12 +1003,7 @@
     </w:p>
     <w:p>
       <w:r>
-        <w:rPr>
-          <w:rFonts w:ascii="微软雅黑" w:hAnsi="微软雅黑" w:eastAsia="微软雅黑"/>
-          <w:color w:val="464646"/>
-          <w:sz w:val="20"/>
-        </w:rPr>
-        <w:t>分支编号规则：主文章局部摘录使用“主序号.小标题序号”（如1.8）；分支DOCX不附原文链接，目录不显示空链接。</w:t>
+        <w:t>分支编号规则：主文章局部摘录使用“年份-主序号.小标题序号”（如2022-1.8）；分支DOCX不附原文链接，目录不显示空链接。</w:t>
       </w:r>
     </w:p>
     <w:sectPr>

</xml_diff>

<commit_message>
docs: add Agent/Yao dual answers and AY双问 command
Save both answers on self-set deadlines as a formatted DOCX, register
the AY双问 trigger, and keep a super-instruction catalog that updates
when new keyword commands are created.

Co-authored-by: 36613453226Wallen <36613453226Wallen@users.noreply.github.com>
</commit_message>
<xml_diff>
--- a/Prompt-姚勇文章半自动收录流程.docx
+++ b/Prompt-姚勇文章半自动收录流程.docx
@@ -1006,6 +1006,28 @@
         <w:t>分支编号规则：主文章局部摘录使用“年份-主序号.小标题序号”（如2022-1.8）；分支DOCX不附原文链接，目录不显示空链接。</w:t>
       </w:r>
     </w:p>
+    <w:p>
+      <w:r>
+        <w:rPr>
+          <w:rFonts w:ascii="黑体" w:hAnsi="黑体" w:eastAsia="黑体"/>
+          <w:b/>
+          <w:color w:val="1F4E79"/>
+          <w:sz w:val="24"/>
+        </w:rPr>
+        <w:t>新增功能：AY双问</w:t>
+      </w:r>
+    </w:p>
+    <w:p>
+      <w:r>
+        <w:rPr>
+          <w:rFonts w:ascii="宋体" w:hAnsi="宋体" w:eastAsia="宋体"/>
+          <w:b w:val="0"/>
+          <w:color w:val="202020"/>
+          <w:sz w:val="22"/>
+        </w:rPr>
+        <w:t>口令：AY双问。按姚勇视角再写一版；将提问与两份回答摘录为单个排版 DOCX，发言人用「表头：」标出；没有问题 / 只有一份回答 / 双份回答分别反馈，并简要说明文件夹 files/问题与视角-agent与Y双版本。若同时产生关键词新指令或提示词命令，自动登记进该文件夹的《*超级指令》。</w:t>
+      </w:r>
+    </w:p>
     <w:sectPr>
       <w:pgSz w:w="12240" w:h="15840"/>
       <w:pgMar w:top="1008" w:right="1152" w:bottom="1008" w:left="1152" w:header="720" w:footer="720" w:gutter="0"/>

</xml_diff>

<commit_message>
docs: add Agent/Yao dual answers and AY双问 command (#16)
Save both answers on self-set deadlines as a formatted DOCX, register
the AY双问 trigger, and keep a super-instruction catalog that updates
when new keyword commands are created.

Co-authored-by: Cursor Agent <cursoragent@cursor.com>
Co-authored-by: 36613453226Wallen <36613453226Wallen@users.noreply.github.com>
</commit_message>
<xml_diff>
--- a/Prompt-姚勇文章半自动收录流程.docx
+++ b/Prompt-姚勇文章半自动收录流程.docx
@@ -1006,6 +1006,28 @@
         <w:t>分支编号规则：主文章局部摘录使用“年份-主序号.小标题序号”（如2022-1.8）；分支DOCX不附原文链接，目录不显示空链接。</w:t>
       </w:r>
     </w:p>
+    <w:p>
+      <w:r>
+        <w:rPr>
+          <w:rFonts w:ascii="黑体" w:hAnsi="黑体" w:eastAsia="黑体"/>
+          <w:b/>
+          <w:color w:val="1F4E79"/>
+          <w:sz w:val="24"/>
+        </w:rPr>
+        <w:t>新增功能：AY双问</w:t>
+      </w:r>
+    </w:p>
+    <w:p>
+      <w:r>
+        <w:rPr>
+          <w:rFonts w:ascii="宋体" w:hAnsi="宋体" w:eastAsia="宋体"/>
+          <w:b w:val="0"/>
+          <w:color w:val="202020"/>
+          <w:sz w:val="22"/>
+        </w:rPr>
+        <w:t>口令：AY双问。按姚勇视角再写一版；将提问与两份回答摘录为单个排版 DOCX，发言人用「表头：」标出；没有问题 / 只有一份回答 / 双份回答分别反馈，并简要说明文件夹 files/问题与视角-agent与Y双版本。若同时产生关键词新指令或提示词命令，自动登记进该文件夹的《*超级指令》。</w:t>
+      </w:r>
+    </w:p>
     <w:sectPr>
       <w:pgSz w:w="12240" w:h="15840"/>
       <w:pgMar w:top="1008" w:right="1152" w:bottom="1008" w:left="1152" w:header="720" w:footer="720" w:gutter="0"/>

</xml_diff>